<commit_message>
Strengthen PM and process-BI analyst resumes for hh.ru
Two targeted CVs: IT project manager for DWH/BI at 400k, and lead process/BI analyst at 350k. CSI and initiative monitoring sit in the opening, titles match vacancy search, junior phrasing and typos from the live hh versions are gone.
</commit_message>
<xml_diff>
--- a/Abramov_DN_resume_ANALYST_process_BI.docx
+++ b/Abramov_DN_resume_ANALYST_process_BI.docx
@@ -122,10 +122,10 @@
         <w:rPr>
           <w:rFonts w:ascii="Arial" w:hAnsi="Arial" w:eastAsia="Arial" w:cs="Arial"/>
           <w:b/>
-          <w:color w:val="222222"/>
+          <w:color w:val="1F3A5F"/>
           <w:sz w:val="24"/>
         </w:rPr>
-        <w:t>Ведущий аналитик процессов и BI (мониторинг, дашборды)</w:t>
+        <w:t>Ведущий аналитик BI / процессов (CSI, мониторинг, дашборды)</w:t>
       </w:r>
     </w:p>
     <w:p>
@@ -223,7 +223,7 @@
           <w:color w:val="222222"/>
           <w:sz w:val="22"/>
         </w:rPr>
-        <w:t>400 000 руб. на руки</w:t>
+        <w:t>350 000 руб. на руки</w:t>
       </w:r>
     </w:p>
     <w:p>
@@ -251,7 +251,7 @@
           <w:color w:val="222222"/>
           <w:sz w:val="21"/>
         </w:rPr>
-        <w:t>Строю процесс, ставлю его на мониторинг и подключаю BI. В Сбере с нуля запустил CSI по департаменту и сквозной контроль работы с инициативами: правила, статусы, регулярная отчётность, дашборд.</w:t>
+        <w:t>Строю процесс, ставлю его на мониторинг и подключаю BI. В Сбере с нуля собрал CSI по 70 продуктам департамента и сквозной контроль работы с инициативами: правила, статусы, дашборд, регулярная отчётность.</w:t>
       </w:r>
     </w:p>
     <w:p>
@@ -265,7 +265,7 @@
           <w:color w:val="222222"/>
           <w:sz w:val="21"/>
         </w:rPr>
-        <w:t>В Axenix собирал управленческую отчётность для руководства. В ПСБ веду хранилище, чтобы такие контуры стояли на данных. Ищу роль ведущего аналитика по процессам, мониторингу и дашбордам.</w:t>
+        <w:t>В Axenix собирал управленческую отчётность для руководства. В ПСБ веду хранилище и витрины, чтобы такие контуры стояли на данных.</w:t>
       </w:r>
     </w:p>
     <w:p>
@@ -393,7 +393,7 @@
           <w:color w:val="222222"/>
           <w:sz w:val="20"/>
         </w:rPr>
-        <w:t>Собрал хранилище на открытом стеке: контуры загрузки, витрины, согласование с архитектурой и информационной безопасностью. Дальше - подключение BI.</w:t>
+        <w:t>Собрал хранилище на Arenadata: контуры загрузки, витрины, согласование с архитектурой и ИБ. Дальше - подключение BI.</w:t>
       </w:r>
     </w:p>
     <w:p>
@@ -425,7 +425,7 @@
           <w:color w:val="222222"/>
           <w:sz w:val="20"/>
         </w:rPr>
-        <w:t>Согласовал цели, дорожную карту, бизнес-требования и ТЗ с ИТ, ИБ и бизнесом. Держу понятный статус по работам.</w:t>
+        <w:t>Согласовал цели, дорожную карту, БТ и ТЗ с ИТ, ИБ и бизнесом.</w:t>
       </w:r>
     </w:p>
     <w:p>
@@ -471,23 +471,7 @@
           <w:color w:val="222222"/>
           <w:sz w:val="20"/>
         </w:rPr>
-        <w:t>Согласование решений с архитектурой и информационной безопасностью.</w:t>
-      </w:r>
-    </w:p>
-    <w:p>
-      <w:pPr>
-        <w:pStyle w:val="ListBullet"/>
-        <w:spacing w:before="0" w:after="40" w:line="240" w:lineRule="auto"/>
-        <w:ind w:left="360"/>
-      </w:pPr>
-      <w:r>
-        <w:rPr>
-          <w:rFonts w:ascii="Arial" w:hAnsi="Arial" w:eastAsia="Arial" w:cs="Arial"/>
-          <w:b w:val="0"/>
-          <w:color w:val="222222"/>
-          <w:sz w:val="20"/>
-        </w:rPr>
-        <w:t>Работа с бизнесом, ИТ и подрядчиками по составу работ и срокам.</w:t>
+        <w:t>Согласование с архитектурой и информационной безопасностью, статус по работам.</w:t>
       </w:r>
     </w:p>
     <w:p>
@@ -573,7 +557,7 @@
           <w:color w:val="222222"/>
           <w:sz w:val="20"/>
         </w:rPr>
-        <w:t>Собрал систему управленческой отчётности и BI для топ-менеджмента НЛМК на платформе Форсайт: дашборды, KPI, регулярная аналитика. В части экранов использовали модели для оценки и прогноза.</w:t>
+        <w:t>Собрал систему управленческой отчётности и BI для топ-менеджмента НЛМК на Форсайт: дашборды, KPI, регулярная аналитика. В части экранов - модели для оценки и прогноза.</w:t>
       </w:r>
     </w:p>
     <w:p>
@@ -719,7 +703,7 @@
           <w:color w:val="222222"/>
           <w:sz w:val="21"/>
         </w:rPr>
-        <w:t>Эксперт по отчётности и BI, вёл контуры аналитики (SberData)</w:t>
+        <w:t>Руководитель направления BI, SberData</w:t>
       </w:r>
     </w:p>
     <w:p>
@@ -749,7 +733,7 @@
           <w:color w:val="222222"/>
           <w:sz w:val="20"/>
         </w:rPr>
-        <w:t>С нуля собрал процесс измерения CSI по департаменту: методика, сбор данных, дашборды на Qlik Sense и QlikView в разрезе продуктов, клиентов (блоки, ДИТ) и динамики.</w:t>
+        <w:t>С нуля собрал процесс измерения CSI по департаменту: методика, сбор по 70 продуктам, дашборды Qlik Sense и QlikView в разрезе продуктов, клиентов (блоки, ДИТ) и динамики. Поставил мониторинг и работу с мероприятиями по улучшению.</w:t>
       </w:r>
     </w:p>
     <w:p>
@@ -765,7 +749,7 @@
           <w:color w:val="222222"/>
           <w:sz w:val="20"/>
         </w:rPr>
-        <w:t>Выстроил процесс работы с бизнес- и ИТ-инициативами и поставил его на мониторинг. Сделал на QlikView дашборд сквозного контроля, в том числе по инициативам с ИИ.</w:t>
+        <w:t>Выстроил процесс работы с бизнес- и ИТ-инициативами и поставил его на мониторинг. Дашборд сквозного контроля на QlikView, в том числе по инициативам с ИИ.</w:t>
       </w:r>
     </w:p>
     <w:p>
@@ -797,7 +781,7 @@
           <w:color w:val="222222"/>
           <w:sz w:val="20"/>
         </w:rPr>
-        <w:t>Связал процесс инициатив с управлением ресурсами. Собрал Portfolio Market Place: планирование задач команд с учётом зависимостей.</w:t>
+        <w:t>Связал процесс инициатив с управлением ресурсами. Собрал Portfolio Market Place по загрузке команд.</w:t>
       </w:r>
     </w:p>
     <w:p>
@@ -813,7 +797,7 @@
           <w:color w:val="222222"/>
           <w:sz w:val="20"/>
         </w:rPr>
-        <w:t>Собрал базу знаний программы «Создание Фабрики данных» и дашборд по ней: ресурсы, инициативы, коллегиальные органы. Настроил сквозной поиск и аналитику.</w:t>
+        <w:t>Запустил дашборд KPI департамента за 3 месяца при плане 6.</w:t>
       </w:r>
     </w:p>
     <w:p>
@@ -829,7 +813,7 @@
           <w:color w:val="222222"/>
           <w:sz w:val="20"/>
         </w:rPr>
-        <w:t>Поставил регулярную отчётность по работе с инициативами на QlikView.</w:t>
+        <w:t>Собрал базу знаний программы «Создание Фабрики данных» и дашборд по ресурсам, инициативам и коллегиальным органам. Настроил сквозной поиск. Поставил регулярную отчётность по инициативам на QlikView.</w:t>
       </w:r>
     </w:p>
     <w:p>
@@ -875,7 +859,7 @@
           <w:color w:val="222222"/>
           <w:sz w:val="20"/>
         </w:rPr>
-        <w:t>Ведение контуров отчётности и мониторинга: бэклог, дашборды, приёмка, обратная связь.</w:t>
+        <w:t>Контуры отчётности и мониторинга: бэклог, дашборды, приёмка, обратная связь.</w:t>
       </w:r>
     </w:p>
     <w:p>
@@ -891,7 +875,7 @@
           <w:color w:val="222222"/>
           <w:sz w:val="20"/>
         </w:rPr>
-        <w:t>Связка процесса инициатив со смежными контурами и статусы для руководства.</w:t>
+        <w:t>Связка процесса инициатив со смежными контурами, статусы для руководства.</w:t>
       </w:r>
     </w:p>
     <w:p>
@@ -975,7 +959,7 @@
           <w:color w:val="222222"/>
           <w:sz w:val="21"/>
         </w:rPr>
-        <w:t>Руководитель направления в дирекции программы «Централизация 2.0» (единая ИТ-платформа банка)</w:t>
+        <w:t>Руководитель направления в дирекции программы «Централизация 2.0»</w:t>
       </w:r>
     </w:p>
     <w:p>
@@ -1021,7 +1005,7 @@
           <w:color w:val="222222"/>
           <w:sz w:val="20"/>
         </w:rPr>
-        <w:t>Собрал процесс коммуникаций программы: стейкхолдеры, внутреннее и внешнее окружение, материалы для УК и Правления.</w:t>
+        <w:t>Собрал процесс коммуникаций программы и отчётность для руководства, УК и Правления.</w:t>
       </w:r>
     </w:p>
     <w:p>
@@ -1037,53 +1021,7 @@
           <w:color w:val="222222"/>
           <w:sz w:val="20"/>
         </w:rPr>
-        <w:t>Программа заняла 1 место IPMA International Project Excellence Award 2015 (крупные проекты) и победила в Celent Model Bank 2016. Я вёл отчётность, коммуникации и материалы для коллегиальных органов.</w:t>
-      </w:r>
-    </w:p>
-    <w:p>
-      <w:pPr>
-        <w:spacing w:before="80" w:after="40" w:line="240" w:lineRule="auto"/>
-      </w:pPr>
-      <w:r>
-        <w:rPr>
-          <w:rFonts w:ascii="Arial" w:hAnsi="Arial" w:eastAsia="Arial" w:cs="Arial"/>
-          <w:b/>
-          <w:color w:val="222222"/>
-          <w:sz w:val="20"/>
-        </w:rPr>
-        <w:t>Обязанности:</w:t>
-      </w:r>
-    </w:p>
-    <w:p>
-      <w:pPr>
-        <w:pStyle w:val="ListBullet"/>
-        <w:spacing w:before="0" w:after="40" w:line="240" w:lineRule="auto"/>
-        <w:ind w:left="360"/>
-      </w:pPr>
-      <w:r>
-        <w:rPr>
-          <w:rFonts w:ascii="Arial" w:hAnsi="Arial" w:eastAsia="Arial" w:cs="Arial"/>
-          <w:b w:val="0"/>
-          <w:color w:val="222222"/>
-          <w:sz w:val="20"/>
-        </w:rPr>
-        <w:t>Отчёты для руководства банка и контролирующих органов.</w:t>
-      </w:r>
-    </w:p>
-    <w:p>
-      <w:pPr>
-        <w:pStyle w:val="ListBullet"/>
-        <w:spacing w:before="0" w:after="40" w:line="240" w:lineRule="auto"/>
-        <w:ind w:left="360"/>
-      </w:pPr>
-      <w:r>
-        <w:rPr>
-          <w:rFonts w:ascii="Arial" w:hAnsi="Arial" w:eastAsia="Arial" w:cs="Arial"/>
-          <w:b w:val="0"/>
-          <w:color w:val="222222"/>
-          <w:sz w:val="20"/>
-        </w:rPr>
-        <w:t>Сбор данных от команд, процесс коммуникаций, материалы к комитетам.</w:t>
+        <w:t>Программа заняла 1 место IPMA 2015 и победила в Celent Model Bank 2016. Я вёл отчётность, коммуникации и материалы для коллегиальных органов.</w:t>
       </w:r>
     </w:p>
     <w:p>
@@ -1102,6 +1040,34 @@
     </w:p>
     <w:p>
       <w:pPr>
+        <w:spacing w:before="40" w:after="0" w:line="240" w:lineRule="auto"/>
+      </w:pPr>
+      <w:r>
+        <w:rPr>
+          <w:rFonts w:ascii="Arial" w:hAnsi="Arial" w:eastAsia="Arial" w:cs="Arial"/>
+          <w:b/>
+          <w:color w:val="1F3A5F"/>
+          <w:sz w:val="22"/>
+        </w:rPr>
+        <w:t>ЗАО «Беллинтегратор»</w:t>
+      </w:r>
+    </w:p>
+    <w:p>
+      <w:pPr>
+        <w:spacing w:before="0" w:after="0" w:line="240" w:lineRule="auto"/>
+      </w:pPr>
+      <w:r>
+        <w:rPr>
+          <w:rFonts w:ascii="Arial" w:hAnsi="Arial" w:eastAsia="Arial" w:cs="Arial"/>
+          <w:b w:val="0"/>
+          <w:color w:val="555555"/>
+          <w:sz w:val="19"/>
+        </w:rPr>
+        <w:t>Москва, www.bellintegrator.ru</w:t>
+      </w:r>
+    </w:p>
+    <w:p>
+      <w:pPr>
         <w:spacing w:before="80" w:after="80" w:line="240" w:lineRule="auto"/>
       </w:pPr>
       <w:r>
@@ -1111,7 +1077,7 @@
           <w:color w:val="222222"/>
           <w:sz w:val="21"/>
         </w:rPr>
-        <w:t>ЗАО «Беллинтегратор». Менеджер проектов BI и мониторинга</w:t>
+        <w:t>Менеджер проектов BI и мониторинга</w:t>
       </w:r>
     </w:p>
     <w:p>
@@ -1125,35 +1091,7 @@
           <w:color w:val="222222"/>
           <w:sz w:val="20"/>
         </w:rPr>
-        <w:t>Больше 30 проектов BI и мониторинга: МТС, ВымпелКом, МегаФон, банки, ЦППК.</w:t>
-      </w:r>
-    </w:p>
-    <w:p>
-      <w:pPr>
-        <w:spacing w:before="0" w:after="40" w:line="240" w:lineRule="auto"/>
-      </w:pPr>
-      <w:r>
-        <w:rPr>
-          <w:rFonts w:ascii="Arial" w:hAnsi="Arial" w:eastAsia="Arial" w:cs="Arial"/>
-          <w:b w:val="0"/>
-          <w:color w:val="222222"/>
-          <w:sz w:val="20"/>
-        </w:rPr>
-        <w:t>Требования, БТ и ТЗ, источники данных, постановка, приёмка, обучение пользователей.</w:t>
-      </w:r>
-    </w:p>
-    <w:p>
-      <w:pPr>
-        <w:spacing w:before="0" w:after="40" w:line="240" w:lineRule="auto"/>
-      </w:pPr>
-      <w:r>
-        <w:rPr>
-          <w:rFonts w:ascii="Arial" w:hAnsi="Arial" w:eastAsia="Arial" w:cs="Arial"/>
-          <w:b w:val="0"/>
-          <w:color w:val="222222"/>
-          <w:sz w:val="20"/>
-        </w:rPr>
-        <w:t>Подбор решения BI или мониторинга под задачу заказчика.</w:t>
+        <w:t>Больше 30 проектов BI и мониторинга: МТС, ВымпелКом, МегаФон, банки, ЦППК. Требования, БТ и ТЗ, источники, постановка, приёмка, обучение.</w:t>
       </w:r>
     </w:p>
     <w:p>
@@ -1172,6 +1110,34 @@
     </w:p>
     <w:p>
       <w:pPr>
+        <w:spacing w:before="40" w:after="0" w:line="240" w:lineRule="auto"/>
+      </w:pPr>
+      <w:r>
+        <w:rPr>
+          <w:rFonts w:ascii="Arial" w:hAnsi="Arial" w:eastAsia="Arial" w:cs="Arial"/>
+          <w:b/>
+          <w:color w:val="1F3A5F"/>
+          <w:sz w:val="22"/>
+        </w:rPr>
+        <w:t>ЗАО «Верисел Проекты»</w:t>
+      </w:r>
+    </w:p>
+    <w:p>
+      <w:pPr>
+        <w:spacing w:before="0" w:after="0" w:line="240" w:lineRule="auto"/>
+      </w:pPr>
+      <w:r>
+        <w:rPr>
+          <w:rFonts w:ascii="Arial" w:hAnsi="Arial" w:eastAsia="Arial" w:cs="Arial"/>
+          <w:b w:val="0"/>
+          <w:color w:val="555555"/>
+          <w:sz w:val="19"/>
+        </w:rPr>
+        <w:t>Москва</w:t>
+      </w:r>
+    </w:p>
+    <w:p>
+      <w:pPr>
         <w:spacing w:before="80" w:after="80" w:line="240" w:lineRule="auto"/>
       </w:pPr>
       <w:r>
@@ -1181,7 +1147,7 @@
           <w:color w:val="222222"/>
           <w:sz w:val="21"/>
         </w:rPr>
-        <w:t>ЗАО «Верисел Проекты». Менеджер проектов по системам мониторинга</w:t>
+        <w:t>Менеджер проектов по системам мониторинга</w:t>
       </w:r>
     </w:p>
     <w:p>
@@ -1195,35 +1161,7 @@
           <w:color w:val="222222"/>
           <w:sz w:val="20"/>
         </w:rPr>
-        <w:t>Пилот мониторинга в ЦентрТелекоме, проекты МТС и ЦентрТелекома.</w:t>
-      </w:r>
-    </w:p>
-    <w:p>
-      <w:pPr>
-        <w:spacing w:before="0" w:after="40" w:line="240" w:lineRule="auto"/>
-      </w:pPr>
-      <w:r>
-        <w:rPr>
-          <w:rFonts w:ascii="Arial" w:hAnsi="Arial" w:eastAsia="Arial" w:cs="Arial"/>
-          <w:b w:val="0"/>
-          <w:color w:val="222222"/>
-          <w:sz w:val="20"/>
-        </w:rPr>
-        <w:t>Мониторинг бизнес-приложений в ИНГ Банк (Евразия).</w:t>
-      </w:r>
-    </w:p>
-    <w:p>
-      <w:pPr>
-        <w:spacing w:before="0" w:after="40" w:line="240" w:lineRule="auto"/>
-      </w:pPr>
-      <w:r>
-        <w:rPr>
-          <w:rFonts w:ascii="Arial" w:hAnsi="Arial" w:eastAsia="Arial" w:cs="Arial"/>
-          <w:b w:val="0"/>
-          <w:color w:val="222222"/>
-          <w:sz w:val="20"/>
-        </w:rPr>
-        <w:t>Проектная документация и координация субподрядчиков.</w:t>
+        <w:t>Пилот в ЦентрТелекоме, проекты МТС. Мониторинг бизнес-приложений в ИНГ Банк (Евразия).</w:t>
       </w:r>
     </w:p>
     <w:p>
@@ -1242,6 +1180,34 @@
     </w:p>
     <w:p>
       <w:pPr>
+        <w:spacing w:before="40" w:after="0" w:line="240" w:lineRule="auto"/>
+      </w:pPr>
+      <w:r>
+        <w:rPr>
+          <w:rFonts w:ascii="Arial" w:hAnsi="Arial" w:eastAsia="Arial" w:cs="Arial"/>
+          <w:b/>
+          <w:color w:val="1F3A5F"/>
+          <w:sz w:val="22"/>
+        </w:rPr>
+        <w:t>МТС</w:t>
+      </w:r>
+    </w:p>
+    <w:p>
+      <w:pPr>
+        <w:spacing w:before="0" w:after="0" w:line="240" w:lineRule="auto"/>
+      </w:pPr>
+      <w:r>
+        <w:rPr>
+          <w:rFonts w:ascii="Arial" w:hAnsi="Arial" w:eastAsia="Arial" w:cs="Arial"/>
+          <w:b w:val="0"/>
+          <w:color w:val="555555"/>
+          <w:sz w:val="19"/>
+        </w:rPr>
+        <w:t>Россия, www.mts.ru</w:t>
+      </w:r>
+    </w:p>
+    <w:p>
+      <w:pPr>
         <w:spacing w:before="80" w:after="80" w:line="240" w:lineRule="auto"/>
       </w:pPr>
       <w:r>
@@ -1251,7 +1217,7 @@
           <w:color w:val="222222"/>
           <w:sz w:val="21"/>
         </w:rPr>
-        <w:t>МТС. Руководитель группы развития системы мониторинга</w:t>
+        <w:t>Руководитель группы развития системы мониторинга</w:t>
       </w:r>
     </w:p>
     <w:p>
@@ -1265,35 +1231,7 @@
           <w:color w:val="222222"/>
           <w:sz w:val="20"/>
         </w:rPr>
-        <w:t>Архитектура и прототип единой системы мониторинга: данные и экраны бизнес-KPI.</w:t>
-      </w:r>
-    </w:p>
-    <w:p>
-      <w:pPr>
-        <w:spacing w:before="0" w:after="40" w:line="240" w:lineRule="auto"/>
-      </w:pPr>
-      <w:r>
-        <w:rPr>
-          <w:rFonts w:ascii="Arial" w:hAnsi="Arial" w:eastAsia="Arial" w:cs="Arial"/>
-          <w:b w:val="0"/>
-          <w:color w:val="222222"/>
-          <w:sz w:val="20"/>
-        </w:rPr>
-        <w:t>Регламенты и инструкции. Защита бюджета на инвесткомитете.</w:t>
-      </w:r>
-    </w:p>
-    <w:p>
-      <w:pPr>
-        <w:spacing w:before="0" w:after="40" w:line="240" w:lineRule="auto"/>
-      </w:pPr>
-      <w:r>
-        <w:rPr>
-          <w:rFonts w:ascii="Arial" w:hAnsi="Arial" w:eastAsia="Arial" w:cs="Arial"/>
-          <w:b w:val="0"/>
-          <w:color w:val="222222"/>
-          <w:sz w:val="20"/>
-        </w:rPr>
-        <w:t>Постановка задач интеграторам, поддержка пользователей.</w:t>
+        <w:t>Прототип единой системы мониторинга: данные и экраны бизнес-KPI. Регламенты, защита бюджета на инвесткомитете.</w:t>
       </w:r>
     </w:p>
     <w:p>
@@ -1368,9 +1306,7 @@
     </w:p>
     <w:p>
       <w:pPr>
-        <w:pStyle w:val="ListBullet"/>
         <w:spacing w:before="0" w:after="40" w:line="240" w:lineRule="auto"/>
-        <w:ind w:left="360"/>
       </w:pPr>
       <w:r>
         <w:rPr>
@@ -1379,39 +1315,7 @@
           <w:color w:val="222222"/>
           <w:sz w:val="20"/>
         </w:rPr>
-        <w:t>Собрал систему биллинга (C#, SQL Server).</w:t>
-      </w:r>
-    </w:p>
-    <w:p>
-      <w:pPr>
-        <w:pStyle w:val="ListBullet"/>
-        <w:spacing w:before="0" w:after="40" w:line="240" w:lineRule="auto"/>
-        <w:ind w:left="360"/>
-      </w:pPr>
-      <w:r>
-        <w:rPr>
-          <w:rFonts w:ascii="Arial" w:hAnsi="Arial" w:eastAsia="Arial" w:cs="Arial"/>
-          <w:b w:val="0"/>
-          <w:color w:val="222222"/>
-          <w:sz w:val="20"/>
-        </w:rPr>
-        <w:t>Собрал CRM для отдела продаж (C#, SQL Server, интерфейс из метаданных).</w:t>
-      </w:r>
-    </w:p>
-    <w:p>
-      <w:pPr>
-        <w:pStyle w:val="ListBullet"/>
-        <w:spacing w:before="0" w:after="40" w:line="240" w:lineRule="auto"/>
-        <w:ind w:left="360"/>
-      </w:pPr>
-      <w:r>
-        <w:rPr>
-          <w:rFonts w:ascii="Arial" w:hAnsi="Arial" w:eastAsia="Arial" w:cs="Arial"/>
-          <w:b w:val="0"/>
-          <w:color w:val="222222"/>
-          <w:sz w:val="20"/>
-        </w:rPr>
-        <w:t>Тарифы, счета, поддержка биллинга, CRM, домена и почты.</w:t>
+        <w:t>Собрал биллинг и CRM (C#, SQL Server). Тарифы, счета, поддержка.</w:t>
       </w:r>
     </w:p>
     <w:p>
@@ -1523,7 +1427,7 @@
           <w:color w:val="555555"/>
           <w:sz w:val="19"/>
         </w:rPr>
-        <w:t>Аренадата, Архитектура DWH</w:t>
+        <w:t>Аренадата</w:t>
       </w:r>
     </w:p>
     <w:p>
@@ -1551,7 +1455,7 @@
           <w:color w:val="555555"/>
           <w:sz w:val="19"/>
         </w:rPr>
-        <w:t>Институт бизнес-аналитики - подготовка данных, построение дашбордов</w:t>
+        <w:t>Институт бизнес-аналитики - подготовка данных, дашборды</w:t>
       </w:r>
     </w:p>
     <w:p>
@@ -1579,7 +1483,7 @@
           <w:color w:val="555555"/>
           <w:sz w:val="19"/>
         </w:rPr>
-        <w:t>Sber</w:t>
+        <w:t>Сбер</w:t>
       </w:r>
     </w:p>
     <w:p>
@@ -1677,7 +1581,7 @@
           <w:color w:val="222222"/>
           <w:sz w:val="20"/>
         </w:rPr>
-        <w:t>2015  «Подготовка презентаций»</w:t>
+        <w:t>2011  QlikView</w:t>
       </w:r>
     </w:p>
     <w:p>
@@ -1691,63 +1595,7 @@
           <w:color w:val="555555"/>
           <w:sz w:val="19"/>
         </w:rPr>
-        <w:t>Авторский курс Алексея Каптерева</w:t>
-      </w:r>
-    </w:p>
-    <w:p>
-      <w:pPr>
-        <w:spacing w:before="80" w:after="0" w:line="240" w:lineRule="auto"/>
-      </w:pPr>
-      <w:r>
-        <w:rPr>
-          <w:rFonts w:ascii="Arial" w:hAnsi="Arial" w:eastAsia="Arial" w:cs="Arial"/>
-          <w:b w:val="0"/>
-          <w:color w:val="222222"/>
-          <w:sz w:val="20"/>
-        </w:rPr>
-        <w:t>2014  «Мастерство переговоров»</w:t>
-      </w:r>
-    </w:p>
-    <w:p>
-      <w:pPr>
-        <w:spacing w:before="0" w:after="40" w:line="240" w:lineRule="auto"/>
-      </w:pPr>
-      <w:r>
-        <w:rPr>
-          <w:rFonts w:ascii="Arial" w:hAnsi="Arial" w:eastAsia="Arial" w:cs="Arial"/>
-          <w:b w:val="0"/>
-          <w:color w:val="555555"/>
-          <w:sz w:val="19"/>
-        </w:rPr>
-        <w:t>Университет риторики и ораторского мастерства</w:t>
-      </w:r>
-    </w:p>
-    <w:p>
-      <w:pPr>
-        <w:spacing w:before="80" w:after="0" w:line="240" w:lineRule="auto"/>
-      </w:pPr>
-      <w:r>
-        <w:rPr>
-          <w:rFonts w:ascii="Arial" w:hAnsi="Arial" w:eastAsia="Arial" w:cs="Arial"/>
-          <w:b w:val="0"/>
-          <w:color w:val="222222"/>
-          <w:sz w:val="20"/>
-        </w:rPr>
-        <w:t>2011  QlikTech</w:t>
-      </w:r>
-    </w:p>
-    <w:p>
-      <w:pPr>
-        <w:spacing w:before="0" w:after="40" w:line="240" w:lineRule="auto"/>
-      </w:pPr>
-      <w:r>
-        <w:rPr>
-          <w:rFonts w:ascii="Arial" w:hAnsi="Arial" w:eastAsia="Arial" w:cs="Arial"/>
-          <w:b w:val="0"/>
-          <w:color w:val="555555"/>
-          <w:sz w:val="19"/>
-        </w:rPr>
-        <w:t>Вендорские курсы по QlikView</w:t>
+        <w:t>Вендорские курсы QlikTech</w:t>
       </w:r>
     </w:p>
     <w:p>
@@ -1850,34 +1698,6 @@
     </w:p>
     <w:p>
       <w:pPr>
-        <w:spacing w:before="80" w:after="0" w:line="240" w:lineRule="auto"/>
-      </w:pPr>
-      <w:r>
-        <w:rPr>
-          <w:rFonts w:ascii="Arial" w:hAnsi="Arial" w:eastAsia="Arial" w:cs="Arial"/>
-          <w:b w:val="0"/>
-          <w:color w:val="222222"/>
-          <w:sz w:val="20"/>
-        </w:rPr>
-        <w:t>2011  Quest Software</w:t>
-      </w:r>
-    </w:p>
-    <w:p>
-      <w:pPr>
-        <w:spacing w:before="0" w:after="40" w:line="240" w:lineRule="auto"/>
-      </w:pPr>
-      <w:r>
-        <w:rPr>
-          <w:rFonts w:ascii="Arial" w:hAnsi="Arial" w:eastAsia="Arial" w:cs="Arial"/>
-          <w:b w:val="0"/>
-          <w:color w:val="555555"/>
-          <w:sz w:val="19"/>
-        </w:rPr>
-        <w:t>Сертификат по решениям для управления и мониторинга баз данных</w:t>
-      </w:r>
-    </w:p>
-    <w:p>
-      <w:pPr>
         <w:spacing w:before="240" w:after="120" w:line="240" w:lineRule="auto"/>
       </w:pPr>
       <w:r>
@@ -1957,7 +1777,7 @@
           <w:color w:val="222222"/>
           <w:sz w:val="20"/>
         </w:rPr>
-        <w:t>Описание процессов  ·  Мониторинг процессов  ·  CSI  ·  Управление инициативами  ·  BI  ·  Дашборды  ·  QlikView  ·  Qlik Sense  ·  Управленческая отчётность  ·  KPI / SLA  ·  Постановка требований  ·  Приёмка  ·  BPMN  ·  Хранилище данных  ·  Витрины  ·  SQL  ·  MS Excel  ·  PowerPoint  ·  Jira  ·  Confluence  ·  Agile</w:t>
+        <w:t>Описание процессов  ·  Мониторинг процессов  ·  CSI  ·  Управление инициативами  ·  BI  ·  Дашборды  ·  QlikView  ·  Qlik Sense  ·  Форсайт  ·  Управленческая отчётность  ·  KPI / SLA  ·  Постановка требований  ·  Приёмка  ·  BPMN  ·  DWH  ·  Витрины  ·  Arenadata  ·  SQL  ·  MS Excel  ·  PowerPoint  ·  Jira  ·  Confluence  ·  Agile</w:t>
       </w:r>
     </w:p>
     <w:p>
@@ -2055,7 +1875,7 @@
           <w:color w:val="222222"/>
           <w:sz w:val="21"/>
         </w:rPr>
-        <w:t>Привык доводить работу до экрана, которым пользуются, а не до описания процесса в папке.</w:t>
+        <w:t>Довожу до экрана, которым пользуются, а не до описания процесса в папке.</w:t>
       </w:r>
     </w:p>
     <w:sectPr>

</xml_diff>